<commit_message>
﻿Invoice template polish: embedded logo, wider totals, add quote layout
- Embed the real Ferrion logo (rasterized PNG) in the header instead of a text wordmark
- Widen the totals label column so the subtotal line no longer wraps
- Derive a second template: Ferrion-Angebotsvorlage.docx (Angebot/Quote) from the shared generator, with ANGEBOT header, Angebotsnr/Gueltig-bis meta, Angebotskonditionen plus notes, and Anbieter/Angebotsempfaenger labels
- scripts/assets/ferrion-logo.png added; generator now emits both documents

Co-Authored-By: Claude Opus 4.8 <noreply@anthropic.com>
</commit_message>
<xml_diff>
--- a/templates/Ferrion-Rechnungsvorlage.docx
+++ b/templates/Ferrion-Rechnungsvorlage.docx
@@ -30,8 +30,8 @@
             </w:tcBorders>
             <w:shd w:fill="0D1117" w:color="auto" w:val="clear"/>
             <w:tcMar>
-              <w:top w:type="dxa" w:w="260"/>
-              <w:left w:type="dxa" w:w="260"/>
+              <w:top w:type="dxa" w:w="240"/>
+              <w:left w:type="dxa" w:w="240"/>
               <w:bottom w:type="dxa" w:w="240"/>
               <w:right w:type="dxa" w:w="120"/>
             </w:tcMar>
@@ -39,30 +39,49 @@
           </w:tcPr>
           <w:p>
             <w:r>
-              <w:rPr>
-                <w:rFonts w:ascii="Arial" w:cs="Arial" w:eastAsia="Arial" w:hAnsi="Arial"/>
-                <w:color w:val="C9A84C"/>
-                <w:sz w:val="28"/>
-                <w:szCs w:val="28"/>
-              </w:rPr>
-              <w:t xml:space="preserve">● </w:t>
-            </w:r>
-            <w:r>
-              <w:rPr>
-                <w:rFonts w:ascii="Arial" w:cs="Arial" w:eastAsia="Arial" w:hAnsi="Arial"/>
-                <w:b/>
-                <w:bCs/>
-                <w:color w:val="FFFFFF"/>
-                <w:spacing w:val="40"/>
-                <w:sz w:val="30"/>
-                <w:szCs w:val="30"/>
-              </w:rPr>
-              <w:t xml:space="preserve">FERRION</w:t>
-            </w:r>
-          </w:p>
-          <w:p>
-            <w:pPr>
-              <w:spacing w:before="40"/>
+              <w:drawing>
+                <wp:inline distT="0" distB="0" distL="0" distR="0">
+                  <wp:extent cx="1676400" cy="419100"/>
+                  <wp:effectExtent t="0" r="0" b="0" l="0"/>
+                  <wp:docPr id="1" name="" descr="" title=""/>
+                  <wp:cNvGraphicFramePr>
+                    <a:graphicFrameLocks xmlns:a="http://schemas.openxmlformats.org/drawingml/2006/main" noChangeAspect="1"/>
+                  </wp:cNvGraphicFramePr>
+                  <a:graphic xmlns:a="http://schemas.openxmlformats.org/drawingml/2006/main">
+                    <a:graphicData uri="http://schemas.openxmlformats.org/drawingml/2006/picture">
+                      <pic:pic xmlns:pic="http://schemas.openxmlformats.org/drawingml/2006/picture">
+                        <pic:nvPicPr>
+                          <pic:cNvPr id="0" name="" descr=""/>
+                          <pic:cNvPicPr>
+                            <a:picLocks noChangeAspect="1" noChangeArrowheads="1"/>
+                          </pic:cNvPicPr>
+                        </pic:nvPicPr>
+                        <pic:blipFill>
+                          <a:blip r:embed="rId7" cstate="none"/>
+                          <a:srcRect/>
+                          <a:stretch>
+                            <a:fillRect/>
+                          </a:stretch>
+                        </pic:blipFill>
+                        <pic:spPr bwMode="auto">
+                          <a:xfrm>
+                            <a:off x="0" y="0"/>
+                            <a:ext cx="1676400" cy="419100"/>
+                          </a:xfrm>
+                          <a:prstGeom prst="rect">
+                            <a:avLst/>
+                          </a:prstGeom>
+                        </pic:spPr>
+                      </pic:pic>
+                    </a:graphicData>
+                  </a:graphic>
+                </wp:inline>
+              </w:drawing>
+            </w:r>
+          </w:p>
+          <w:p>
+            <w:pPr>
+              <w:spacing w:before="60"/>
             </w:pPr>
             <w:r>
               <w:rPr>
@@ -135,7 +154,6 @@
         <w:pBdr>
           <w:bottom w:val="single" w:color="C9A84C" w:sz="12" w:space="1"/>
         </w:pBdr>
-        <w:spacing w:after="0" w:before="0"/>
       </w:pPr>
     </w:p>
     <w:tbl>
@@ -1094,14 +1112,14 @@
         </w:tblBorders>
       </w:tblPr>
       <w:tblGrid>
-        <w:gridCol w:w="6478"/>
-        <w:gridCol w:w="1580"/>
-        <w:gridCol w:w="1580"/>
+        <w:gridCol w:w="3898"/>
+        <w:gridCol w:w="3580"/>
+        <w:gridCol w:w="2160"/>
       </w:tblGrid>
       <w:tr>
         <w:tc>
           <w:tcPr>
-            <w:tcW w:type="dxa" w:w="6478"/>
+            <w:tcW w:type="dxa" w:w="3898"/>
             <w:tcBorders>
               <w:top w:val="none" w:color="FFFFFF" w:sz="0"/>
               <w:left w:val="none" w:color="FFFFFF" w:sz="0"/>
@@ -1120,7 +1138,7 @@
         </w:tc>
         <w:tc>
           <w:tcPr>
-            <w:tcW w:type="dxa" w:w="1580"/>
+            <w:tcW w:type="dxa" w:w="3580"/>
             <w:tcBorders>
               <w:top w:val="none" w:color="FFFFFF" w:sz="0"/>
               <w:left w:val="none" w:color="FFFFFF" w:sz="0"/>
@@ -1153,7 +1171,7 @@
         </w:tc>
         <w:tc>
           <w:tcPr>
-            <w:tcW w:type="dxa" w:w="1580"/>
+            <w:tcW w:type="dxa" w:w="2160"/>
             <w:tcBorders>
               <w:top w:val="none" w:color="FFFFFF" w:sz="0"/>
               <w:left w:val="none" w:color="FFFFFF" w:sz="0"/>
@@ -1188,7 +1206,7 @@
       <w:tr>
         <w:tc>
           <w:tcPr>
-            <w:tcW w:type="dxa" w:w="6478"/>
+            <w:tcW w:type="dxa" w:w="3898"/>
             <w:tcBorders>
               <w:top w:val="none" w:color="FFFFFF" w:sz="0"/>
               <w:left w:val="none" w:color="FFFFFF" w:sz="0"/>
@@ -1207,7 +1225,7 @@
         </w:tc>
         <w:tc>
           <w:tcPr>
-            <w:tcW w:type="dxa" w:w="1580"/>
+            <w:tcW w:type="dxa" w:w="3580"/>
             <w:tcBorders>
               <w:top w:val="none" w:color="FFFFFF" w:sz="0"/>
               <w:left w:val="none" w:color="FFFFFF" w:sz="0"/>
@@ -1240,7 +1258,7 @@
         </w:tc>
         <w:tc>
           <w:tcPr>
-            <w:tcW w:type="dxa" w:w="1580"/>
+            <w:tcW w:type="dxa" w:w="2160"/>
             <w:tcBorders>
               <w:top w:val="none" w:color="FFFFFF" w:sz="0"/>
               <w:left w:val="none" w:color="FFFFFF" w:sz="0"/>
@@ -1275,7 +1293,7 @@
       <w:tr>
         <w:tc>
           <w:tcPr>
-            <w:tcW w:type="dxa" w:w="6478"/>
+            <w:tcW w:type="dxa" w:w="3898"/>
             <w:tcBorders>
               <w:top w:val="none" w:color="FFFFFF" w:sz="0"/>
               <w:left w:val="none" w:color="FFFFFF" w:sz="0"/>
@@ -1294,7 +1312,7 @@
         </w:tc>
         <w:tc>
           <w:tcPr>
-            <w:tcW w:type="dxa" w:w="1580"/>
+            <w:tcW w:type="dxa" w:w="3580"/>
             <w:tcBorders>
               <w:top w:val="none" w:color="FFFFFF" w:sz="0"/>
               <w:left w:val="none" w:color="FFFFFF" w:sz="0"/>
@@ -1328,7 +1346,7 @@
         </w:tc>
         <w:tc>
           <w:tcPr>
-            <w:tcW w:type="dxa" w:w="1580"/>
+            <w:tcW w:type="dxa" w:w="2160"/>
             <w:tcBorders>
               <w:top w:val="none" w:color="FFFFFF" w:sz="0"/>
               <w:left w:val="none" w:color="FFFFFF" w:sz="0"/>
@@ -1665,7 +1683,7 @@
           <w:sz w:val="12"/>
           <w:szCs w:val="12"/>
         </w:rPr>
-        <w:t xml:space="preserve">Platzhalter in { } werden beim Erzeugen automatisch aus den Portal-Daten (Order / Quote / Kunde) befüllt.</w:t>
+        <w:t xml:space="preserve">Platzhalter in { } werden beim Erzeugen automatisch aus den Portal-Daten befüllt.</w:t>
       </w:r>
     </w:p>
     <w:sectPr>

</xml_diff>